<commit_message>
docs: update report with A7 flowchart and checkpoints
</commit_message>
<xml_diff>
--- a/docs/Laporan_UTS_Hybrid_Computing_Ripki_Maulana.docx
+++ b/docs/Laporan_UTS_Hybrid_Computing_Ripki_Maulana.docx
@@ -25,6 +25,7 @@
         <w:spacing w:after="120" w:line="360" w:lineRule="auto"/>
         <w:jc w:val="center"/>
         <w:rPr>
+          <w:color w:val="000000" w:themeColor="text1"/>
           <w:sz w:val="24"/>
           <w:szCs w:val="24"/>
         </w:rPr>
@@ -33,7 +34,7 @@
         <w:rPr>
           <w:rFonts w:ascii="Times New Roman" w:eastAsia="Times New Roman" w:hAnsi="Times New Roman" w:cs="Times New Roman"/>
           <w:b/>
-          <w:color w:val="auto"/>
+          <w:color w:val="000000" w:themeColor="text1"/>
           <w:sz w:val="24"/>
           <w:szCs w:val="24"/>
         </w:rPr>
@@ -48,7 +49,7 @@
         <w:rPr>
           <w:rFonts w:ascii="Times New Roman" w:eastAsia="Times New Roman" w:hAnsi="Times New Roman" w:cs="Times New Roman"/>
           <w:b/>
-          <w:color w:val="auto"/>
+          <w:color w:val="000000" w:themeColor="text1"/>
           <w:sz w:val="22"/>
           <w:szCs w:val="22"/>
         </w:rPr>
@@ -57,7 +58,7 @@
         <w:rPr>
           <w:rFonts w:ascii="Times New Roman" w:eastAsia="Times New Roman" w:hAnsi="Times New Roman" w:cs="Times New Roman"/>
           <w:b/>
-          <w:color w:val="auto"/>
+          <w:color w:val="000000" w:themeColor="text1"/>
           <w:sz w:val="22"/>
           <w:szCs w:val="22"/>
         </w:rPr>
@@ -185,6 +186,7 @@
         <w:rPr>
           <w:rFonts w:ascii="Times New Roman" w:hAnsi="Times New Roman" w:cs="Times New Roman"/>
           <w:b/>
+          <w:color w:val="000000" w:themeColor="text1"/>
           <w:sz w:val="24"/>
           <w:szCs w:val="28"/>
         </w:rPr>
@@ -194,6 +196,7 @@
         <w:rPr>
           <w:rFonts w:ascii="Times New Roman" w:hAnsi="Times New Roman" w:cs="Times New Roman"/>
           <w:b/>
+          <w:color w:val="000000" w:themeColor="text1"/>
           <w:sz w:val="24"/>
           <w:szCs w:val="28"/>
         </w:rPr>
@@ -204,6 +207,7 @@
         <w:rPr>
           <w:rFonts w:ascii="Times New Roman" w:hAnsi="Times New Roman" w:cs="Times New Roman"/>
           <w:b/>
+          <w:color w:val="000000" w:themeColor="text1"/>
           <w:sz w:val="24"/>
           <w:szCs w:val="28"/>
         </w:rPr>
@@ -217,6 +221,7 @@
         <w:rPr>
           <w:rFonts w:ascii="Times New Roman" w:hAnsi="Times New Roman" w:cs="Times New Roman"/>
           <w:b/>
+          <w:color w:val="000000" w:themeColor="text1"/>
           <w:sz w:val="24"/>
           <w:szCs w:val="28"/>
           <w:lang w:val="id-ID"/>
@@ -229,6 +234,7 @@
         <w:jc w:val="center"/>
         <w:rPr>
           <w:rFonts w:ascii="Times New Roman" w:eastAsia="Yu Mincho" w:hAnsi="Times New Roman" w:cs="Times New Roman"/>
+          <w:color w:val="000000" w:themeColor="text1"/>
           <w:kern w:val="2"/>
           <w:sz w:val="28"/>
           <w:szCs w:val="28"/>
@@ -239,6 +245,7 @@
       <w:r>
         <w:rPr>
           <w:rFonts w:ascii="Times New Roman" w:eastAsia="Yu Mincho" w:hAnsi="Times New Roman" w:cs="Times New Roman"/>
+          <w:color w:val="000000" w:themeColor="text1"/>
           <w:kern w:val="2"/>
           <w:sz w:val="28"/>
           <w:szCs w:val="28"/>
@@ -250,6 +257,7 @@
       <w:r>
         <w:rPr>
           <w:rFonts w:ascii="Times New Roman" w:eastAsia="Yu Mincho" w:hAnsi="Times New Roman" w:cs="Times New Roman"/>
+          <w:color w:val="000000" w:themeColor="text1"/>
           <w:kern w:val="2"/>
           <w:sz w:val="28"/>
           <w:szCs w:val="28"/>
@@ -261,6 +269,7 @@
       <w:r>
         <w:rPr>
           <w:rFonts w:ascii="Times New Roman" w:eastAsia="Yu Mincho" w:hAnsi="Times New Roman" w:cs="Times New Roman"/>
+          <w:color w:val="000000" w:themeColor="text1"/>
           <w:kern w:val="2"/>
           <w:sz w:val="28"/>
           <w:szCs w:val="28"/>
@@ -272,6 +281,7 @@
       <w:r>
         <w:rPr>
           <w:rFonts w:ascii="Times New Roman" w:eastAsia="Yu Mincho" w:hAnsi="Times New Roman" w:cs="Times New Roman"/>
+          <w:color w:val="000000" w:themeColor="text1"/>
           <w:kern w:val="2"/>
           <w:sz w:val="28"/>
           <w:szCs w:val="28"/>
@@ -306,6 +316,7 @@
         <w:rPr>
           <w:rFonts w:ascii="Times New Roman" w:hAnsi="Times New Roman" w:cs="Times New Roman"/>
           <w:b/>
+          <w:color w:val="000000" w:themeColor="text1"/>
           <w:sz w:val="28"/>
           <w:szCs w:val="32"/>
         </w:rPr>
@@ -314,6 +325,7 @@
         <w:rPr>
           <w:rFonts w:ascii="Times New Roman" w:hAnsi="Times New Roman" w:cs="Times New Roman"/>
           <w:b/>
+          <w:color w:val="000000" w:themeColor="text1"/>
           <w:sz w:val="28"/>
           <w:szCs w:val="32"/>
         </w:rPr>
@@ -327,6 +339,7 @@
         <w:rPr>
           <w:rFonts w:ascii="Times New Roman" w:hAnsi="Times New Roman" w:cs="Times New Roman"/>
           <w:b/>
+          <w:color w:val="000000" w:themeColor="text1"/>
           <w:sz w:val="28"/>
           <w:szCs w:val="32"/>
         </w:rPr>
@@ -335,6 +348,7 @@
         <w:rPr>
           <w:rFonts w:ascii="Times New Roman" w:hAnsi="Times New Roman" w:cs="Times New Roman"/>
           <w:b/>
+          <w:color w:val="000000" w:themeColor="text1"/>
           <w:sz w:val="28"/>
           <w:szCs w:val="32"/>
         </w:rPr>
@@ -348,6 +362,7 @@
         <w:rPr>
           <w:rFonts w:ascii="Times New Roman" w:hAnsi="Times New Roman" w:cs="Times New Roman"/>
           <w:b/>
+          <w:color w:val="000000" w:themeColor="text1"/>
           <w:sz w:val="28"/>
           <w:szCs w:val="32"/>
         </w:rPr>
@@ -356,6 +371,7 @@
         <w:rPr>
           <w:rFonts w:ascii="Times New Roman" w:hAnsi="Times New Roman" w:cs="Times New Roman"/>
           <w:b/>
+          <w:color w:val="000000" w:themeColor="text1"/>
           <w:sz w:val="28"/>
           <w:szCs w:val="32"/>
         </w:rPr>
@@ -369,6 +385,7 @@
         <w:rPr>
           <w:rFonts w:ascii="Times New Roman" w:hAnsi="Times New Roman" w:cs="Times New Roman"/>
           <w:b/>
+          <w:color w:val="000000" w:themeColor="text1"/>
           <w:sz w:val="28"/>
           <w:szCs w:val="32"/>
         </w:rPr>
@@ -388,6 +405,7 @@
         <w:rPr>
           <w:rFonts w:ascii="Times New Roman" w:hAnsi="Times New Roman" w:cs="Times New Roman"/>
           <w:b/>
+          <w:color w:val="000000" w:themeColor="text1"/>
           <w:sz w:val="28"/>
           <w:szCs w:val="32"/>
         </w:rPr>
@@ -402,14 +420,6 @@
           <w:color w:val="000000" w:themeColor="text1"/>
         </w:rPr>
       </w:pPr>
-      <w:r>
-        <w:rPr>
-          <w:rFonts w:ascii="Times New Roman" w:hAnsi="Times New Roman" w:cs="Times New Roman"/>
-          <w:color w:val="000000" w:themeColor="text1"/>
-        </w:rPr>
-        <w:lastRenderedPageBreak/>
-        <w:br w:type="page"/>
-      </w:r>
     </w:p>
     <w:p>
       <w:pPr>
@@ -419,14 +429,6 @@
           <w:color w:val="000000" w:themeColor="text1"/>
         </w:rPr>
       </w:pPr>
-      <w:r>
-        <w:rPr>
-          <w:rFonts w:ascii="Times New Roman" w:hAnsi="Times New Roman" w:cs="Times New Roman"/>
-          <w:color w:val="000000" w:themeColor="text1"/>
-        </w:rPr>
-        <w:lastRenderedPageBreak/>
-        <w:br w:type="page"/>
-      </w:r>
     </w:p>
     <w:p>
       <w:pPr>
@@ -440,7 +442,6 @@
         <w:rPr>
           <w:rFonts w:cs="Times New Roman"/>
         </w:rPr>
-        <w:lastRenderedPageBreak/>
         <w:t>BAGIAN A — KONSEP DAN DESAIN</w:t>
       </w:r>
     </w:p>
@@ -11070,10 +11071,120 @@
           <w:color w:val="000000" w:themeColor="text1"/>
         </w:rPr>
       </w:pPr>
+      <w:r>
+        <w:rPr>
+          <w:rFonts w:ascii="Times New Roman" w:hAnsi="Times New Roman" w:cs="Times New Roman"/>
+          <w:color w:val="000000" w:themeColor="text1"/>
+        </w:rPr>
+        <w:br w:type="page"/>
+      </w:r>
+    </w:p>
+    <w:p>
+      <w:pPr>
+        <w:pStyle w:val="Heading1"/>
+      </w:pPr>
+      <w:r>
+        <w:lastRenderedPageBreak/>
+        <w:t>LAMPIRAN</w:t>
+      </w:r>
+    </w:p>
+    <w:p>
+      <w:pPr>
+        <w:pStyle w:val="NoSpacing"/>
+        <w:rPr>
+          <w:rFonts w:ascii="Times New Roman" w:hAnsi="Times New Roman" w:cs="Times New Roman"/>
+          <w:sz w:val="28"/>
+          <w:szCs w:val="28"/>
+        </w:rPr>
+      </w:pPr>
+      <w:r>
+        <w:rPr>
+          <w:rFonts w:ascii="Times New Roman" w:hAnsi="Times New Roman" w:cs="Times New Roman"/>
+          <w:sz w:val="28"/>
+          <w:szCs w:val="28"/>
+        </w:rPr>
+        <w:t>Link Deploy:</w:t>
+      </w:r>
+      <w:r>
+        <w:rPr>
+          <w:rFonts w:ascii="Times New Roman" w:hAnsi="Times New Roman" w:cs="Times New Roman"/>
+          <w:sz w:val="28"/>
+          <w:szCs w:val="28"/>
+        </w:rPr>
+        <w:t xml:space="preserve"> </w:t>
+      </w:r>
+      <w:hyperlink r:id="rId21" w:history="1">
+        <w:r>
+          <w:rPr>
+            <w:rStyle w:val="Hyperlink"/>
+            <w:rFonts w:ascii="Times New Roman" w:hAnsi="Times New Roman" w:cs="Times New Roman"/>
+            <w:sz w:val="28"/>
+            <w:szCs w:val="28"/>
+          </w:rPr>
+          <w:t>https://antworld-production.up.railway.app/</w:t>
+        </w:r>
+      </w:hyperlink>
+    </w:p>
+    <w:p>
+      <w:pPr>
+        <w:pStyle w:val="NoSpacing"/>
+        <w:rPr>
+          <w:rFonts w:ascii="Times New Roman" w:hAnsi="Times New Roman" w:cs="Times New Roman"/>
+          <w:sz w:val="28"/>
+          <w:szCs w:val="28"/>
+        </w:rPr>
+      </w:pPr>
+    </w:p>
+    <w:p>
+      <w:pPr>
+        <w:pStyle w:val="NoSpacing"/>
+        <w:rPr>
+          <w:rFonts w:ascii="Times New Roman" w:hAnsi="Times New Roman" w:cs="Times New Roman"/>
+          <w:sz w:val="28"/>
+          <w:szCs w:val="28"/>
+        </w:rPr>
+      </w:pPr>
+      <w:r>
+        <w:rPr>
+          <w:rFonts w:ascii="Times New Roman" w:hAnsi="Times New Roman" w:cs="Times New Roman"/>
+          <w:sz w:val="28"/>
+          <w:szCs w:val="28"/>
+        </w:rPr>
+        <w:t xml:space="preserve">Link </w:t>
+      </w:r>
+      <w:proofErr w:type="spellStart"/>
+      <w:r>
+        <w:rPr>
+          <w:rFonts w:ascii="Times New Roman" w:hAnsi="Times New Roman" w:cs="Times New Roman"/>
+          <w:sz w:val="28"/>
+          <w:szCs w:val="28"/>
+        </w:rPr>
+        <w:t>Github</w:t>
+      </w:r>
+      <w:proofErr w:type="spellEnd"/>
+      <w:r>
+        <w:rPr>
+          <w:rFonts w:ascii="Times New Roman" w:hAnsi="Times New Roman" w:cs="Times New Roman"/>
+          <w:sz w:val="28"/>
+          <w:szCs w:val="28"/>
+        </w:rPr>
+        <w:t xml:space="preserve">: </w:t>
+      </w:r>
+      <w:hyperlink r:id="rId22" w:history="1">
+        <w:r>
+          <w:rPr>
+            <w:rStyle w:val="Hyperlink"/>
+            <w:rFonts w:ascii="Times New Roman" w:hAnsi="Times New Roman" w:cs="Times New Roman"/>
+            <w:sz w:val="28"/>
+            <w:szCs w:val="28"/>
+          </w:rPr>
+          <w:t>https://github.com/ripkimaulana1210-del/AntWorld.git</w:t>
+        </w:r>
+      </w:hyperlink>
     </w:p>
     <w:sectPr>
-      <w:headerReference w:type="default" r:id="rId21"/>
-      <w:footerReference w:type="default" r:id="rId22"/>
+      <w:headerReference w:type="default" r:id="rId23"/>
+      <w:footerReference w:type="default" r:id="rId24"/>
       <w:pgSz w:w="11906" w:h="16838"/>
       <w:pgMar w:top="1123" w:right="1224" w:bottom="1037" w:left="1224" w:header="504" w:footer="504" w:gutter="0"/>
       <w:cols w:space="720"/>
@@ -12872,6 +12983,29 @@
       </w:tblBorders>
     </w:tblPr>
   </w:style>
+  <w:style w:type="paragraph" w:styleId="NoSpacing">
+    <w:name w:val="No Spacing"/>
+    <w:uiPriority w:val="1"/>
+    <w:qFormat/>
+    <w:rsid w:val="00BC2200"/>
+    <w:rPr>
+      <w:rFonts w:ascii="Aptos" w:hAnsi="Aptos"/>
+      <w:color w:val="263746"/>
+      <w:sz w:val="20"/>
+    </w:rPr>
+  </w:style>
+  <w:style w:type="character" w:styleId="UnresolvedMention">
+    <w:name w:val="Unresolved Mention"/>
+    <w:basedOn w:val="DefaultParagraphFont"/>
+    <w:uiPriority w:val="99"/>
+    <w:semiHidden/>
+    <w:unhideWhenUsed/>
+    <w:rsid w:val="00BC2200"/>
+    <w:rPr>
+      <w:color w:val="605E5C"/>
+      <w:shd w:val="clear" w:color="auto" w:fill="E1DFDD"/>
+    </w:rPr>
+  </w:style>
 </w:styles>
 </file>
 

</xml_diff>

<commit_message>
docs: add dark code screenshots and clarify map visuals
</commit_message>
<xml_diff>
--- a/docs/Laporan_UTS_Hybrid_Computing_Ripki_Maulana.docx
+++ b/docs/Laporan_UTS_Hybrid_Computing_Ripki_Maulana.docx
@@ -114,16 +114,16 @@
       </w:pPr>
       <w:r>
         <w:rPr>
-          <w:rFonts w:ascii="Times New Roman" w:eastAsia="Times New Roman" w:hAnsi="Times New Roman" w:cs="Times New Roman"/>
+          <w:rFonts w:eastAsia="Times New Roman" w:cs="Arial"/>
           <w:b/>
           <w:noProof/>
           <w:szCs w:val="24"/>
         </w:rPr>
         <w:drawing>
-          <wp:inline distT="0" distB="0" distL="0" distR="0" wp14:anchorId="613A9D91" wp14:editId="20BB9E6B">
-            <wp:extent cx="2247900" cy="3086100"/>
+          <wp:inline distT="0" distB="0" distL="0" distR="0" wp14:anchorId="3C346ABA" wp14:editId="0535B3E1">
+            <wp:extent cx="2880000" cy="2880000"/>
             <wp:effectExtent l="0" t="0" r="0" b="0"/>
-            <wp:docPr id="1" name="Picture 1"/>
+            <wp:docPr id="2" name="Picture 2"/>
             <wp:cNvGraphicFramePr>
               <a:graphicFrameLocks xmlns:a="http://schemas.openxmlformats.org/drawingml/2006/main"/>
             </wp:cNvGraphicFramePr>
@@ -152,7 +152,7 @@
                   <pic:spPr bwMode="auto">
                     <a:xfrm>
                       <a:off x="0" y="0"/>
-                      <a:ext cx="2247900" cy="3086100"/>
+                      <a:ext cx="2880000" cy="2880000"/>
                     </a:xfrm>
                     <a:prstGeom prst="rect">
                       <a:avLst/>
@@ -576,7 +576,7 @@
         </w:rPr>
         <w:lastRenderedPageBreak/>
         <w:drawing>
-          <wp:inline distT="0" distB="0" distL="0" distR="0" wp14:anchorId="58B92112" wp14:editId="5136A434">
+          <wp:inline distT="0" distB="0" distL="0" distR="0" wp14:anchorId="10E7DCA2" wp14:editId="2A07F491">
             <wp:extent cx="5623560" cy="3342041"/>
             <wp:effectExtent l="0" t="0" r="0" b="0"/>
             <wp:docPr id="22" name="Picture 22"/>
@@ -1541,7 +1541,7 @@
           <w:color w:val="000000" w:themeColor="text1"/>
         </w:rPr>
         <w:drawing>
-          <wp:inline distT="0" distB="0" distL="0" distR="0" wp14:anchorId="3846319D" wp14:editId="77EA1BE3">
+          <wp:inline distT="0" distB="0" distL="0" distR="0" wp14:anchorId="0E3E1D9E" wp14:editId="0003000F">
             <wp:extent cx="5577840" cy="1502270"/>
             <wp:effectExtent l="0" t="0" r="0" b="0"/>
             <wp:docPr id="23" name="Picture 23"/>
@@ -2519,7 +2519,7 @@
           <w:color w:val="000000" w:themeColor="text1"/>
         </w:rPr>
         <w:drawing>
-          <wp:inline distT="0" distB="0" distL="0" distR="0" wp14:anchorId="6B3CDB15" wp14:editId="18ADAC24">
+          <wp:inline distT="0" distB="0" distL="0" distR="0" wp14:anchorId="0E25E1C5" wp14:editId="5E52FD63">
             <wp:extent cx="5806440" cy="3039351"/>
             <wp:effectExtent l="0" t="0" r="0" b="0"/>
             <wp:docPr id="21" name="Picture 21"/>
@@ -3254,7 +3254,7 @@
           <w:color w:val="000000" w:themeColor="text1"/>
         </w:rPr>
         <w:drawing>
-          <wp:inline distT="0" distB="0" distL="0" distR="0" wp14:anchorId="59B1B020" wp14:editId="10BEADAB">
+          <wp:inline distT="0" distB="0" distL="0" distR="0" wp14:anchorId="30CF96D2" wp14:editId="26D9BBF9">
             <wp:extent cx="5806440" cy="2333688"/>
             <wp:effectExtent l="0" t="0" r="0" b="0"/>
             <wp:docPr id="24" name="Picture 24"/>
@@ -4187,7 +4187,29 @@
           <w:szCs w:val="22"/>
           <w:lang w:val="en-ID" w:eastAsia="en-ID"/>
         </w:rPr>
-        <w:t xml:space="preserve">Simulasi melakukan langkah semut, menyelesaikan pengambilan/deposit, menggabungkan jejak yang selesai, menguapkan feromon dan menaikkan penghitung iterasi. Metrik state mencakup iterasi, status, makanan terkumpul/sisa, jumlah perjalanan, jumlah semut membawa makanan, pheromone average/maximum, </w:t>
+        <w:t xml:space="preserve">Simulasi melakukan langkah semut, menyelesaikan pengambilan/deposit, menggabungkan jejak yang selesai, menguapkan feromon dan menaikkan penghitung iterasi. Metrik state mencakup iterasi, status, makanan terkumpul/sisa, jumlah perjalanan, jumlah semut membawa </w:t>
+      </w:r>
+      <w:proofErr w:type="spellStart"/>
+      <w:r>
+        <w:rPr>
+          <w:rFonts w:ascii="Times New Roman" w:eastAsia="Times New Roman" w:hAnsi="Times New Roman" w:cs="Times New Roman"/>
+          <w:color w:val="auto"/>
+          <w:sz w:val="22"/>
+          <w:szCs w:val="22"/>
+          <w:lang w:val="en-ID" w:eastAsia="en-ID"/>
+        </w:rPr>
+        <w:t>makanan</w:t>
+      </w:r>
+      <w:proofErr w:type="spellEnd"/>
+      <w:r>
+        <w:rPr>
+          <w:rFonts w:ascii="Times New Roman" w:eastAsia="Times New Roman" w:hAnsi="Times New Roman" w:cs="Times New Roman"/>
+          <w:color w:val="auto"/>
+          <w:sz w:val="22"/>
+          <w:szCs w:val="22"/>
+          <w:lang w:val="en-ID" w:eastAsia="en-ID"/>
+        </w:rPr>
+        <w:t xml:space="preserve">, pheromone average/maximum, </w:t>
       </w:r>
       <w:proofErr w:type="spellStart"/>
       <w:r>
@@ -4409,6 +4431,133 @@
     </w:p>
     <w:p>
       <w:pPr>
+        <w:keepNext/>
+        <w:jc w:val="center"/>
+      </w:pPr>
+      <w:r>
+        <w:rPr>
+          <w:rFonts w:ascii="Times New Roman" w:hAnsi="Times New Roman"/>
+          <w:sz w:val="18"/>
+        </w:rPr>
+        <w:lastRenderedPageBreak/>
+        <w:t>Kode 1. Gerak semut, penghindaran sel yang baru dikunjungi, dan interaksi pengambilan makanan.</w:t>
+      </w:r>
+    </w:p>
+    <w:p>
+      <w:pPr>
+        <w:keepLines/>
+        <w:jc w:val="center"/>
+      </w:pPr>
+      <w:r>
+        <w:rPr>
+          <w:noProof/>
+        </w:rPr>
+        <w:drawing>
+          <wp:inline distT="0" distB="0" distL="0" distR="0" wp14:anchorId="0A0D1674" wp14:editId="33230F32">
+            <wp:extent cx="5623560" cy="7392818"/>
+            <wp:effectExtent l="0" t="0" r="0" b="0"/>
+            <wp:docPr id="25" name="Picture 25"/>
+            <wp:cNvGraphicFramePr>
+              <a:graphicFrameLocks xmlns:a="http://schemas.openxmlformats.org/drawingml/2006/main" noChangeAspect="1"/>
+            </wp:cNvGraphicFramePr>
+            <a:graphic xmlns:a="http://schemas.openxmlformats.org/drawingml/2006/main">
+              <a:graphicData uri="http://schemas.openxmlformats.org/drawingml/2006/picture">
+                <pic:pic xmlns:pic="http://schemas.openxmlformats.org/drawingml/2006/picture">
+                  <pic:nvPicPr>
+                    <pic:cNvPr id="0" name="code_ant_foraging.png"/>
+                    <pic:cNvPicPr/>
+                  </pic:nvPicPr>
+                  <pic:blipFill>
+                    <a:blip r:embed="rId16"/>
+                    <a:stretch>
+                      <a:fillRect/>
+                    </a:stretch>
+                  </pic:blipFill>
+                  <pic:spPr>
+                    <a:xfrm>
+                      <a:off x="0" y="0"/>
+                      <a:ext cx="5623560" cy="7392818"/>
+                    </a:xfrm>
+                    <a:prstGeom prst="rect">
+                      <a:avLst/>
+                    </a:prstGeom>
+                  </pic:spPr>
+                </pic:pic>
+              </a:graphicData>
+            </a:graphic>
+          </wp:inline>
+        </w:drawing>
+      </w:r>
+    </w:p>
+    <w:p>
+      <w:pPr>
+        <w:keepNext/>
+        <w:jc w:val="center"/>
+      </w:pPr>
+      <w:r>
+        <w:rPr>
+          <w:rFonts w:ascii="Times New Roman" w:hAnsi="Times New Roman"/>
+          <w:sz w:val="18"/>
+        </w:rPr>
+        <w:lastRenderedPageBreak/>
+        <w:t>Kode 2. Urutan satu langkah simulasi serial: gerak semut,</w:t>
+      </w:r>
+      <w:r>
+        <w:rPr>
+          <w:rFonts w:ascii="Times New Roman" w:hAnsi="Times New Roman"/>
+          <w:sz w:val="18"/>
+        </w:rPr>
+        <w:t xml:space="preserve"> pengumpulan makanan, deposit jejak sukses, dan evaporasi pheromone.</w:t>
+      </w:r>
+    </w:p>
+    <w:p>
+      <w:pPr>
+        <w:keepLines/>
+        <w:jc w:val="center"/>
+      </w:pPr>
+      <w:r>
+        <w:rPr>
+          <w:noProof/>
+        </w:rPr>
+        <w:drawing>
+          <wp:inline distT="0" distB="0" distL="0" distR="0" wp14:anchorId="630ACDB3" wp14:editId="30823261">
+            <wp:extent cx="5623560" cy="4507500"/>
+            <wp:effectExtent l="0" t="0" r="0" b="0"/>
+            <wp:docPr id="26" name="Picture 26"/>
+            <wp:cNvGraphicFramePr>
+              <a:graphicFrameLocks xmlns:a="http://schemas.openxmlformats.org/drawingml/2006/main" noChangeAspect="1"/>
+            </wp:cNvGraphicFramePr>
+            <a:graphic xmlns:a="http://schemas.openxmlformats.org/drawingml/2006/main">
+              <a:graphicData uri="http://schemas.openxmlformats.org/drawingml/2006/picture">
+                <pic:pic xmlns:pic="http://schemas.openxmlformats.org/drawingml/2006/picture">
+                  <pic:nvPicPr>
+                    <pic:cNvPr id="0" name="code_serial_step.png"/>
+                    <pic:cNvPicPr/>
+                  </pic:nvPicPr>
+                  <pic:blipFill>
+                    <a:blip r:embed="rId17"/>
+                    <a:stretch>
+                      <a:fillRect/>
+                    </a:stretch>
+                  </pic:blipFill>
+                  <pic:spPr>
+                    <a:xfrm>
+                      <a:off x="0" y="0"/>
+                      <a:ext cx="5623560" cy="4507500"/>
+                    </a:xfrm>
+                    <a:prstGeom prst="rect">
+                      <a:avLst/>
+                    </a:prstGeom>
+                  </pic:spPr>
+                </pic:pic>
+              </a:graphicData>
+            </a:graphic>
+          </wp:inline>
+        </w:drawing>
+      </w:r>
+    </w:p>
+    <w:p>
+      <w:pPr>
         <w:pStyle w:val="Heading2"/>
         <w:spacing w:line="360" w:lineRule="auto"/>
         <w:rPr>
@@ -4535,6 +4684,13 @@
           <w:color w:val="000000" w:themeColor="text1"/>
         </w:rPr>
         <w:br/>
+      </w:r>
+      <w:r>
+        <w:rPr>
+          <w:rFonts w:ascii="Courier New" w:hAnsi="Courier New" w:cs="Courier New"/>
+          <w:color w:val="000000" w:themeColor="text1"/>
+        </w:rPr>
+        <w:lastRenderedPageBreak/>
         <w:t>results = [future.result() for future in futures]  # barrier</w:t>
       </w:r>
       <w:r>
@@ -4552,6 +4708,65 @@
         </w:rPr>
         <w:br/>
         <w:t># hasil kemudian digabung dan diterapkan pada state utama</w:t>
+      </w:r>
+    </w:p>
+    <w:p>
+      <w:pPr>
+        <w:keepNext/>
+        <w:jc w:val="center"/>
+      </w:pPr>
+      <w:r>
+        <w:rPr>
+          <w:rFonts w:ascii="Times New Roman" w:hAnsi="Times New Roman"/>
+          <w:sz w:val="18"/>
+        </w:rPr>
+        <w:t>Kode 3. Pengiriman chunk ant ke ProcessPoolExecutor dan barrier yang menunggu seluruh worker.</w:t>
+      </w:r>
+    </w:p>
+    <w:p>
+      <w:pPr>
+        <w:keepLines/>
+        <w:jc w:val="center"/>
+      </w:pPr>
+      <w:r>
+        <w:rPr>
+          <w:noProof/>
+        </w:rPr>
+        <w:drawing>
+          <wp:inline distT="0" distB="0" distL="0" distR="0" wp14:anchorId="0DD391BA" wp14:editId="088A41EC">
+            <wp:extent cx="5623560" cy="3253013"/>
+            <wp:effectExtent l="0" t="0" r="0" b="0"/>
+            <wp:docPr id="27" name="Picture 27"/>
+            <wp:cNvGraphicFramePr>
+              <a:graphicFrameLocks xmlns:a="http://schemas.openxmlformats.org/drawingml/2006/main" noChangeAspect="1"/>
+            </wp:cNvGraphicFramePr>
+            <a:graphic xmlns:a="http://schemas.openxmlformats.org/drawingml/2006/main">
+              <a:graphicData uri="http://schemas.openxmlformats.org/drawingml/2006/picture">
+                <pic:pic xmlns:pic="http://schemas.openxmlformats.org/drawingml/2006/picture">
+                  <pic:nvPicPr>
+                    <pic:cNvPr id="0" name="code_processpool_barrier.png"/>
+                    <pic:cNvPicPr/>
+                  </pic:nvPicPr>
+                  <pic:blipFill>
+                    <a:blip r:embed="rId18"/>
+                    <a:stretch>
+                      <a:fillRect/>
+                    </a:stretch>
+                  </pic:blipFill>
+                  <pic:spPr>
+                    <a:xfrm>
+                      <a:off x="0" y="0"/>
+                      <a:ext cx="5623560" cy="3253013"/>
+                    </a:xfrm>
+                    <a:prstGeom prst="rect">
+                      <a:avLst/>
+                    </a:prstGeom>
+                  </pic:spPr>
+                </pic:pic>
+              </a:graphicData>
+            </a:graphic>
+          </wp:inline>
+        </w:drawing>
       </w:r>
     </w:p>
     <w:p>
@@ -4610,7 +4825,6 @@
           <w:rFonts w:ascii="Courier New" w:hAnsi="Courier New" w:cs="Courier New"/>
           <w:color w:val="000000" w:themeColor="text1"/>
         </w:rPr>
-        <w:lastRenderedPageBreak/>
         <w:t># Pola submit I/O dari komponen I/O</w:t>
       </w:r>
       <w:r>
@@ -4718,6 +4932,73 @@
     </w:p>
     <w:p>
       <w:pPr>
+        <w:keepNext/>
+        <w:jc w:val="center"/>
+      </w:pPr>
+      <w:r>
+        <w:rPr>
+          <w:rFonts w:ascii="Times New Roman" w:hAnsi="Times New Roman"/>
+          <w:sz w:val="18"/>
+        </w:rPr>
+        <w:lastRenderedPageBreak/>
+        <w:t>Kode 4. ThreadPoolExecutor untuk checkpoint, statistik,</w:t>
+      </w:r>
+      <w:r>
+        <w:rPr>
+          <w:rFonts w:ascii="Times New Roman" w:hAnsi="Times New Roman"/>
+          <w:sz w:val="18"/>
+        </w:rPr>
+        <w:t xml:space="preserve"> dan penulisan CSV secara asynchronous.</w:t>
+      </w:r>
+    </w:p>
+    <w:p>
+      <w:pPr>
+        <w:keepLines/>
+        <w:jc w:val="center"/>
+      </w:pPr>
+      <w:r>
+        <w:rPr>
+          <w:noProof/>
+        </w:rPr>
+        <w:drawing>
+          <wp:inline distT="0" distB="0" distL="0" distR="0" wp14:anchorId="3B0FBACC" wp14:editId="657E098F">
+            <wp:extent cx="5623560" cy="6012883"/>
+            <wp:effectExtent l="0" t="0" r="0" b="0"/>
+            <wp:docPr id="28" name="Picture 28"/>
+            <wp:cNvGraphicFramePr>
+              <a:graphicFrameLocks xmlns:a="http://schemas.openxmlformats.org/drawingml/2006/main" noChangeAspect="1"/>
+            </wp:cNvGraphicFramePr>
+            <a:graphic xmlns:a="http://schemas.openxmlformats.org/drawingml/2006/main">
+              <a:graphicData uri="http://schemas.openxmlformats.org/drawingml/2006/picture">
+                <pic:pic xmlns:pic="http://schemas.openxmlformats.org/drawingml/2006/picture">
+                  <pic:nvPicPr>
+                    <pic:cNvPr id="0" name="code_threadpool_io.png"/>
+                    <pic:cNvPicPr/>
+                  </pic:nvPicPr>
+                  <pic:blipFill>
+                    <a:blip r:embed="rId19"/>
+                    <a:stretch>
+                      <a:fillRect/>
+                    </a:stretch>
+                  </pic:blipFill>
+                  <pic:spPr>
+                    <a:xfrm>
+                      <a:off x="0" y="0"/>
+                      <a:ext cx="5623560" cy="6012883"/>
+                    </a:xfrm>
+                    <a:prstGeom prst="rect">
+                      <a:avLst/>
+                    </a:prstGeom>
+                  </pic:spPr>
+                </pic:pic>
+              </a:graphicData>
+            </a:graphic>
+          </wp:inline>
+        </w:drawing>
+      </w:r>
+    </w:p>
+    <w:p>
+      <w:pPr>
         <w:pStyle w:val="Heading2"/>
         <w:spacing w:line="360" w:lineRule="auto"/>
         <w:rPr>
@@ -4795,7 +5076,18 @@
           <w:szCs w:val="22"/>
           <w:lang w:val="en-ID" w:eastAsia="en-ID"/>
         </w:rPr>
-        <w:t>Baseline serial menjadi pembanding speedup. Untuk tiap konfigurasi, seed, jumlah semut, jumlah iterasi, dan logika simulasi dijaga sama antara serial dan hybrid. Benchmark mencatat waktu simulasi serial dan hybrid berpasangan. Waktu awalisasi/persiapan pool tidak dipisahkan pada tabel, sehingga waktu terukur merepresentasikan batas timer implementasi benchmark.</w:t>
+        <w:t xml:space="preserve">Baseline serial menjadi pembanding speedup. Untuk tiap konfigurasi, seed, jumlah semut, jumlah iterasi, dan logika simulasi dijaga sama antara serial dan hybrid. Benchmark mencatat waktu </w:t>
+      </w:r>
+      <w:r>
+        <w:rPr>
+          <w:rFonts w:ascii="Times New Roman" w:eastAsia="Times New Roman" w:hAnsi="Times New Roman" w:cs="Times New Roman"/>
+          <w:color w:val="auto"/>
+          <w:sz w:val="22"/>
+          <w:szCs w:val="22"/>
+          <w:lang w:val="en-ID" w:eastAsia="en-ID"/>
+        </w:rPr>
+        <w:lastRenderedPageBreak/>
+        <w:t>simulasi serial dan hybrid berpasangan. Waktu awalisasi/persiapan pool tidak dipisahkan pada tabel, sehingga waktu terukur merepresentasikan batas timer implementasi benchmark.</w:t>
       </w:r>
     </w:p>
     <w:p>
@@ -4860,7 +5152,29 @@
           <w:szCs w:val="22"/>
           <w:lang w:val="en-ID" w:eastAsia="en-ID"/>
         </w:rPr>
-        <w:t xml:space="preserve">Empat pasangan pengukuran mencatat execution time, speedup, efficiency, throughput, jumlah makanan, serta kecocokan hasil deterministik. Grafik terkontrol memperbandingkan thread, process, dan konfigurasi </w:t>
+        <w:t xml:space="preserve">Empat pasangan pengukuran mencatat execution time, speedup, efficiency, throughput, jumlah makanan, serta kecocokan hasil deterministik. Grafik terkontrol memperbandingkan thread, process, dan </w:t>
+      </w:r>
+      <w:proofErr w:type="spellStart"/>
+      <w:r>
+        <w:rPr>
+          <w:rFonts w:ascii="Times New Roman" w:eastAsia="Times New Roman" w:hAnsi="Times New Roman" w:cs="Times New Roman"/>
+          <w:color w:val="auto"/>
+          <w:sz w:val="22"/>
+          <w:szCs w:val="22"/>
+          <w:lang w:val="en-ID" w:eastAsia="en-ID"/>
+        </w:rPr>
+        <w:t>konfigurasi</w:t>
+      </w:r>
+      <w:proofErr w:type="spellEnd"/>
+      <w:r>
+        <w:rPr>
+          <w:rFonts w:ascii="Times New Roman" w:eastAsia="Times New Roman" w:hAnsi="Times New Roman" w:cs="Times New Roman"/>
+          <w:color w:val="auto"/>
+          <w:sz w:val="22"/>
+          <w:szCs w:val="22"/>
+          <w:lang w:val="en-ID" w:eastAsia="en-ID"/>
+        </w:rPr>
+        <w:t xml:space="preserve"> </w:t>
       </w:r>
       <w:proofErr w:type="spellStart"/>
       <w:r>
@@ -4965,7 +5279,6 @@
                 <w:color w:val="000000" w:themeColor="text1"/>
                 <w:sz w:val="17"/>
               </w:rPr>
-              <w:lastRenderedPageBreak/>
               <w:t>Metrik</w:t>
             </w:r>
           </w:p>
@@ -5422,7 +5735,7 @@
         </w:rPr>
         <w:lastRenderedPageBreak/>
         <w:drawing>
-          <wp:inline distT="0" distB="0" distL="0" distR="0" wp14:anchorId="7E193E20" wp14:editId="29715CFE">
+          <wp:inline distT="0" distB="0" distL="0" distR="0" wp14:anchorId="2F41B0E8" wp14:editId="062C74B9">
             <wp:extent cx="5303520" cy="3646170"/>
             <wp:effectExtent l="0" t="0" r="0" b="0"/>
             <wp:docPr id="16" name="Picture 16"/>
@@ -5437,7 +5750,7 @@
                     <pic:cNvPicPr/>
                   </pic:nvPicPr>
                   <pic:blipFill>
-                    <a:blip r:embed="rId16"/>
+                    <a:blip r:embed="rId20"/>
                     <a:stretch>
                       <a:fillRect/>
                     </a:stretch>
@@ -5518,7 +5831,7 @@
         </w:rPr>
         <w:lastRenderedPageBreak/>
         <w:drawing>
-          <wp:inline distT="0" distB="0" distL="0" distR="0" wp14:anchorId="7D09506A" wp14:editId="695EF209">
+          <wp:inline distT="0" distB="0" distL="0" distR="0" wp14:anchorId="728698C6" wp14:editId="309FCD48">
             <wp:extent cx="5623560" cy="6511491"/>
             <wp:effectExtent l="0" t="0" r="0" b="0"/>
             <wp:docPr id="17" name="Picture 17"/>
@@ -5533,7 +5846,7 @@
                     <pic:cNvPicPr/>
                   </pic:nvPicPr>
                   <pic:blipFill>
-                    <a:blip r:embed="rId17"/>
+                    <a:blip r:embed="rId21"/>
                     <a:stretch>
                       <a:fillRect/>
                     </a:stretch>
@@ -5619,6 +5932,133 @@
     </w:p>
     <w:p>
       <w:pPr>
+        <w:keepNext/>
+        <w:jc w:val="center"/>
+      </w:pPr>
+      <w:r>
+        <w:rPr>
+          <w:rFonts w:ascii="Times New Roman" w:hAnsi="Times New Roman"/>
+          <w:sz w:val="18"/>
+        </w:rPr>
+        <w:lastRenderedPageBreak/>
+        <w:t xml:space="preserve">Kode 5. Loop demo hybrid menahan simulasi saat pause, menunggu resume/restart, dan </w:t>
+      </w:r>
+      <w:r>
+        <w:rPr>
+          <w:rFonts w:ascii="Times New Roman" w:hAnsi="Times New Roman"/>
+          <w:sz w:val="18"/>
+        </w:rPr>
+        <w:t>memproses ulang state saat restart.</w:t>
+      </w:r>
+    </w:p>
+    <w:p>
+      <w:pPr>
+        <w:keepLines/>
+        <w:jc w:val="center"/>
+      </w:pPr>
+      <w:r>
+        <w:rPr>
+          <w:noProof/>
+        </w:rPr>
+        <w:drawing>
+          <wp:inline distT="0" distB="0" distL="0" distR="0" wp14:anchorId="7D93059D" wp14:editId="0C4B5CA9">
+            <wp:extent cx="5623560" cy="6514678"/>
+            <wp:effectExtent l="0" t="0" r="0" b="0"/>
+            <wp:docPr id="29" name="Picture 29"/>
+            <wp:cNvGraphicFramePr>
+              <a:graphicFrameLocks xmlns:a="http://schemas.openxmlformats.org/drawingml/2006/main" noChangeAspect="1"/>
+            </wp:cNvGraphicFramePr>
+            <a:graphic xmlns:a="http://schemas.openxmlformats.org/drawingml/2006/main">
+              <a:graphicData uri="http://schemas.openxmlformats.org/drawingml/2006/picture">
+                <pic:pic xmlns:pic="http://schemas.openxmlformats.org/drawingml/2006/picture">
+                  <pic:nvPicPr>
+                    <pic:cNvPr id="0" name="code_pause_restart.png"/>
+                    <pic:cNvPicPr/>
+                  </pic:nvPicPr>
+                  <pic:blipFill>
+                    <a:blip r:embed="rId22"/>
+                    <a:stretch>
+                      <a:fillRect/>
+                    </a:stretch>
+                  </pic:blipFill>
+                  <pic:spPr>
+                    <a:xfrm>
+                      <a:off x="0" y="0"/>
+                      <a:ext cx="5623560" cy="6514678"/>
+                    </a:xfrm>
+                    <a:prstGeom prst="rect">
+                      <a:avLst/>
+                    </a:prstGeom>
+                  </pic:spPr>
+                </pic:pic>
+              </a:graphicData>
+            </a:graphic>
+          </wp:inline>
+        </w:drawing>
+      </w:r>
+    </w:p>
+    <w:p>
+      <w:pPr>
+        <w:keepNext/>
+        <w:jc w:val="center"/>
+      </w:pPr>
+      <w:r>
+        <w:rPr>
+          <w:rFonts w:ascii="Times New Roman" w:hAnsi="Times New Roman"/>
+          <w:sz w:val="18"/>
+        </w:rPr>
+        <w:lastRenderedPageBreak/>
+        <w:t>Kode 6. Endpoint POST dashboard untuk start, pause, resume, dan restart; respons diteruskan dari state controller.</w:t>
+      </w:r>
+    </w:p>
+    <w:p>
+      <w:pPr>
+        <w:keepLines/>
+        <w:jc w:val="center"/>
+      </w:pPr>
+      <w:r>
+        <w:rPr>
+          <w:noProof/>
+        </w:rPr>
+        <w:drawing>
+          <wp:inline distT="0" distB="0" distL="0" distR="0" wp14:anchorId="422E865A" wp14:editId="0DE50510">
+            <wp:extent cx="5623560" cy="5636537"/>
+            <wp:effectExtent l="0" t="0" r="0" b="0"/>
+            <wp:docPr id="30" name="Picture 30"/>
+            <wp:cNvGraphicFramePr>
+              <a:graphicFrameLocks xmlns:a="http://schemas.openxmlformats.org/drawingml/2006/main" noChangeAspect="1"/>
+            </wp:cNvGraphicFramePr>
+            <a:graphic xmlns:a="http://schemas.openxmlformats.org/drawingml/2006/main">
+              <a:graphicData uri="http://schemas.openxmlformats.org/drawingml/2006/picture">
+                <pic:pic xmlns:pic="http://schemas.openxmlformats.org/drawingml/2006/picture">
+                  <pic:nvPicPr>
+                    <pic:cNvPr id="0" name="code_control_api.png"/>
+                    <pic:cNvPicPr/>
+                  </pic:nvPicPr>
+                  <pic:blipFill>
+                    <a:blip r:embed="rId23"/>
+                    <a:stretch>
+                      <a:fillRect/>
+                    </a:stretch>
+                  </pic:blipFill>
+                  <pic:spPr>
+                    <a:xfrm>
+                      <a:off x="0" y="0"/>
+                      <a:ext cx="5623560" cy="5636537"/>
+                    </a:xfrm>
+                    <a:prstGeom prst="rect">
+                      <a:avLst/>
+                    </a:prstGeom>
+                  </pic:spPr>
+                </pic:pic>
+              </a:graphicData>
+            </a:graphic>
+          </wp:inline>
+        </w:drawing>
+      </w:r>
+    </w:p>
+    <w:p>
+      <w:pPr>
         <w:pStyle w:val="Heading1"/>
         <w:spacing w:line="360" w:lineRule="auto"/>
         <w:rPr>
@@ -5629,7 +6069,6 @@
         <w:rPr>
           <w:rFonts w:cs="Times New Roman"/>
         </w:rPr>
-        <w:lastRenderedPageBreak/>
         <w:t>BAGIAN C — HASIL EKSPERIMEN DAN ANALISIS</w:t>
       </w:r>
     </w:p>
@@ -6232,6 +6671,7 @@
           <w:szCs w:val="22"/>
           <w:lang w:val="en-ID" w:eastAsia="en-ID"/>
         </w:rPr>
+        <w:lastRenderedPageBreak/>
         <w:t xml:space="preserve">Interpreter yang digunakan saat pengukuran adalah Python 3.14.3. Pustaka eksternal yang tercantum sebagai dependensi project adalah NumPy, Matplotlib, dan pandas; executor menggunakan </w:t>
       </w:r>
       <w:proofErr w:type="gramStart"/>
@@ -7239,7 +7679,6 @@
           <w:rFonts w:ascii="Times New Roman" w:hAnsi="Times New Roman" w:cs="Times New Roman"/>
           <w:color w:val="000000" w:themeColor="text1"/>
         </w:rPr>
-        <w:lastRenderedPageBreak/>
         <w:t>C3. Konfigurasi Eksperimen</w:t>
       </w:r>
     </w:p>
@@ -7422,6 +7861,60 @@
     </w:p>
     <w:p>
       <w:pPr>
+        <w:spacing w:after="0" w:line="360" w:lineRule="auto"/>
+        <w:rPr>
+          <w:rFonts w:ascii="Times New Roman" w:hAnsi="Times New Roman" w:cs="Times New Roman"/>
+          <w:color w:val="000000" w:themeColor="text1"/>
+        </w:rPr>
+      </w:pPr>
+    </w:p>
+    <w:p>
+      <w:pPr>
+        <w:spacing w:after="0" w:line="360" w:lineRule="auto"/>
+        <w:rPr>
+          <w:rFonts w:ascii="Times New Roman" w:hAnsi="Times New Roman" w:cs="Times New Roman"/>
+          <w:color w:val="000000" w:themeColor="text1"/>
+        </w:rPr>
+      </w:pPr>
+    </w:p>
+    <w:p>
+      <w:pPr>
+        <w:spacing w:after="0" w:line="360" w:lineRule="auto"/>
+        <w:rPr>
+          <w:rFonts w:ascii="Times New Roman" w:hAnsi="Times New Roman" w:cs="Times New Roman"/>
+          <w:color w:val="000000" w:themeColor="text1"/>
+        </w:rPr>
+      </w:pPr>
+    </w:p>
+    <w:p>
+      <w:pPr>
+        <w:spacing w:after="0" w:line="360" w:lineRule="auto"/>
+        <w:rPr>
+          <w:rFonts w:ascii="Times New Roman" w:hAnsi="Times New Roman" w:cs="Times New Roman"/>
+          <w:color w:val="000000" w:themeColor="text1"/>
+        </w:rPr>
+      </w:pPr>
+    </w:p>
+    <w:p>
+      <w:pPr>
+        <w:spacing w:after="0" w:line="360" w:lineRule="auto"/>
+        <w:rPr>
+          <w:rFonts w:ascii="Times New Roman" w:hAnsi="Times New Roman" w:cs="Times New Roman"/>
+          <w:color w:val="000000" w:themeColor="text1"/>
+        </w:rPr>
+      </w:pPr>
+    </w:p>
+    <w:p>
+      <w:pPr>
+        <w:spacing w:after="0" w:line="360" w:lineRule="auto"/>
+        <w:rPr>
+          <w:rFonts w:ascii="Times New Roman" w:hAnsi="Times New Roman" w:cs="Times New Roman"/>
+          <w:color w:val="000000" w:themeColor="text1"/>
+        </w:rPr>
+      </w:pPr>
+    </w:p>
+    <w:p>
+      <w:pPr>
         <w:pStyle w:val="Heading2"/>
         <w:spacing w:line="360" w:lineRule="auto"/>
         <w:rPr>
@@ -7434,6 +7927,7 @@
           <w:rFonts w:ascii="Times New Roman" w:hAnsi="Times New Roman" w:cs="Times New Roman"/>
           <w:color w:val="000000" w:themeColor="text1"/>
         </w:rPr>
+        <w:lastRenderedPageBreak/>
         <w:t>C4. Hasil Benchmark</w:t>
       </w:r>
     </w:p>
@@ -8624,7 +9118,7 @@
           <w:szCs w:val="22"/>
           <w:lang w:val="en-ID" w:eastAsia="en-ID"/>
         </w:rPr>
-        <w:t xml:space="preserve">Setiap konfigurasi menjalankan 100 iterasi dengan seed yang sama antara serial dan hybrid; program menyatakan hasil deterministik cocok. Food collected tercatat 0 pada seluruh konfigurasi. Untuk 1.390 ants, konfigurasi personal mencatat waktu hybrid 3,0904 s, speedup 1,4878×, efficiency 49,59%, throughput 449,77 ants/s. Perubahan thread ke 1 menghasilkan waktu 3,1341 s; dua proses memberi 3,5167 s. Data 500 ants mempunyai waktu hybrid 2,1577 s dan speedup 0,9190×. Nilai food collected sebesar 0 menunjukkan bahwa pada konfigurasi dan durasi pengujian belum terdapat perjalanan lengkap dari sumber makanan kembali ke nest. Kondisi ini tidak mengubah perbandingan waktu eksekusi karena seluruh konfigurasi menggunakan workload dan jumlah iterasi yang sama, tetapi menjadi keterbatasan pada </w:t>
+        <w:t xml:space="preserve">Setiap konfigurasi menjalankan 100 iterasi dengan seed yang sama antara serial dan hybrid; program menyatakan hasil deterministik cocok. Food collected tercatat 0 pada seluruh konfigurasi. Untuk 1.390 ants, konfigurasi personal mencatat waktu hybrid 3,0904 s, speedup 1,4878×, efficiency 49,59%, throughput 449,77 ants/s. Perubahan thread ke 1 menghasilkan waktu 3,1341 s; dua proses memberi 3,5167 s. Data 500 ants mempunyai waktu hybrid 2,1577 s dan speedup 0,9190×. Nilai food collected sebesar 0 menunjukkan bahwa pada konfigurasi dan durasi pengujian belum terdapat perjalanan lengkap dari sumber makanan kembali ke nest. Kondisi ini tidak mengubah perbandingan waktu eksekusi karena seluruh konfigurasi menggunakan workload dan jumlah iterasi yang sama, tetapi </w:t>
       </w:r>
       <w:proofErr w:type="spellStart"/>
       <w:r>
@@ -8635,6 +9129,50 @@
           <w:szCs w:val="22"/>
           <w:lang w:val="en-ID" w:eastAsia="en-ID"/>
         </w:rPr>
+        <w:t>menjadi</w:t>
+      </w:r>
+      <w:proofErr w:type="spellEnd"/>
+      <w:r>
+        <w:rPr>
+          <w:rFonts w:ascii="Times New Roman" w:eastAsia="Times New Roman" w:hAnsi="Times New Roman" w:cs="Times New Roman"/>
+          <w:color w:val="auto"/>
+          <w:sz w:val="22"/>
+          <w:szCs w:val="22"/>
+          <w:lang w:val="en-ID" w:eastAsia="en-ID"/>
+        </w:rPr>
+        <w:t xml:space="preserve"> </w:t>
+      </w:r>
+      <w:proofErr w:type="spellStart"/>
+      <w:r>
+        <w:rPr>
+          <w:rFonts w:ascii="Times New Roman" w:eastAsia="Times New Roman" w:hAnsi="Times New Roman" w:cs="Times New Roman"/>
+          <w:color w:val="auto"/>
+          <w:sz w:val="22"/>
+          <w:szCs w:val="22"/>
+          <w:lang w:val="en-ID" w:eastAsia="en-ID"/>
+        </w:rPr>
+        <w:t>keterbatasan</w:t>
+      </w:r>
+      <w:proofErr w:type="spellEnd"/>
+      <w:r>
+        <w:rPr>
+          <w:rFonts w:ascii="Times New Roman" w:eastAsia="Times New Roman" w:hAnsi="Times New Roman" w:cs="Times New Roman"/>
+          <w:color w:val="auto"/>
+          <w:sz w:val="22"/>
+          <w:szCs w:val="22"/>
+          <w:lang w:val="en-ID" w:eastAsia="en-ID"/>
+        </w:rPr>
+        <w:t xml:space="preserve"> pada </w:t>
+      </w:r>
+      <w:proofErr w:type="spellStart"/>
+      <w:r>
+        <w:rPr>
+          <w:rFonts w:ascii="Times New Roman" w:eastAsia="Times New Roman" w:hAnsi="Times New Roman" w:cs="Times New Roman"/>
+          <w:color w:val="auto"/>
+          <w:sz w:val="22"/>
+          <w:szCs w:val="22"/>
+          <w:lang w:val="en-ID" w:eastAsia="en-ID"/>
+        </w:rPr>
         <w:t>aspek</w:t>
       </w:r>
       <w:proofErr w:type="spellEnd"/>
@@ -8692,146 +9230,6 @@
         </w:rPr>
         <w:t>.</w:t>
       </w:r>
-    </w:p>
-    <w:p>
-      <w:pPr>
-        <w:spacing w:after="120" w:line="360" w:lineRule="auto"/>
-        <w:ind w:left="578" w:firstLine="556"/>
-        <w:jc w:val="both"/>
-        <w:rPr>
-          <w:rFonts w:ascii="Times New Roman" w:eastAsia="Times New Roman" w:hAnsi="Times New Roman" w:cs="Times New Roman"/>
-          <w:color w:val="auto"/>
-          <w:sz w:val="22"/>
-          <w:szCs w:val="22"/>
-          <w:lang w:val="en-ID" w:eastAsia="en-ID"/>
-        </w:rPr>
-      </w:pPr>
-    </w:p>
-    <w:p>
-      <w:pPr>
-        <w:spacing w:after="120" w:line="360" w:lineRule="auto"/>
-        <w:ind w:left="578" w:firstLine="556"/>
-        <w:jc w:val="both"/>
-        <w:rPr>
-          <w:rFonts w:ascii="Times New Roman" w:eastAsia="Times New Roman" w:hAnsi="Times New Roman" w:cs="Times New Roman"/>
-          <w:color w:val="auto"/>
-          <w:sz w:val="22"/>
-          <w:szCs w:val="22"/>
-          <w:lang w:val="en-ID" w:eastAsia="en-ID"/>
-        </w:rPr>
-      </w:pPr>
-    </w:p>
-    <w:p>
-      <w:pPr>
-        <w:spacing w:after="120" w:line="360" w:lineRule="auto"/>
-        <w:ind w:left="578" w:firstLine="556"/>
-        <w:jc w:val="both"/>
-        <w:rPr>
-          <w:rFonts w:ascii="Times New Roman" w:eastAsia="Times New Roman" w:hAnsi="Times New Roman" w:cs="Times New Roman"/>
-          <w:color w:val="auto"/>
-          <w:sz w:val="22"/>
-          <w:szCs w:val="22"/>
-          <w:lang w:val="en-ID" w:eastAsia="en-ID"/>
-        </w:rPr>
-      </w:pPr>
-    </w:p>
-    <w:p>
-      <w:pPr>
-        <w:spacing w:after="120" w:line="360" w:lineRule="auto"/>
-        <w:ind w:left="578" w:firstLine="556"/>
-        <w:jc w:val="both"/>
-        <w:rPr>
-          <w:rFonts w:ascii="Times New Roman" w:eastAsia="Times New Roman" w:hAnsi="Times New Roman" w:cs="Times New Roman"/>
-          <w:color w:val="auto"/>
-          <w:sz w:val="22"/>
-          <w:szCs w:val="22"/>
-          <w:lang w:val="en-ID" w:eastAsia="en-ID"/>
-        </w:rPr>
-      </w:pPr>
-    </w:p>
-    <w:p>
-      <w:pPr>
-        <w:spacing w:after="120" w:line="360" w:lineRule="auto"/>
-        <w:ind w:left="578" w:firstLine="556"/>
-        <w:jc w:val="both"/>
-        <w:rPr>
-          <w:rFonts w:ascii="Times New Roman" w:eastAsia="Times New Roman" w:hAnsi="Times New Roman" w:cs="Times New Roman"/>
-          <w:color w:val="auto"/>
-          <w:sz w:val="22"/>
-          <w:szCs w:val="22"/>
-          <w:lang w:val="en-ID" w:eastAsia="en-ID"/>
-        </w:rPr>
-      </w:pPr>
-    </w:p>
-    <w:p>
-      <w:pPr>
-        <w:spacing w:after="120" w:line="360" w:lineRule="auto"/>
-        <w:ind w:left="578" w:firstLine="556"/>
-        <w:jc w:val="both"/>
-        <w:rPr>
-          <w:rFonts w:ascii="Times New Roman" w:eastAsia="Times New Roman" w:hAnsi="Times New Roman" w:cs="Times New Roman"/>
-          <w:color w:val="auto"/>
-          <w:sz w:val="22"/>
-          <w:szCs w:val="22"/>
-          <w:lang w:val="en-ID" w:eastAsia="en-ID"/>
-        </w:rPr>
-      </w:pPr>
-    </w:p>
-    <w:p>
-      <w:pPr>
-        <w:spacing w:after="120" w:line="360" w:lineRule="auto"/>
-        <w:ind w:left="578" w:firstLine="556"/>
-        <w:jc w:val="both"/>
-        <w:rPr>
-          <w:rFonts w:ascii="Times New Roman" w:eastAsia="Times New Roman" w:hAnsi="Times New Roman" w:cs="Times New Roman"/>
-          <w:color w:val="auto"/>
-          <w:sz w:val="22"/>
-          <w:szCs w:val="22"/>
-          <w:lang w:val="en-ID" w:eastAsia="en-ID"/>
-        </w:rPr>
-      </w:pPr>
-    </w:p>
-    <w:p>
-      <w:pPr>
-        <w:spacing w:after="120" w:line="360" w:lineRule="auto"/>
-        <w:ind w:left="578" w:firstLine="556"/>
-        <w:jc w:val="both"/>
-        <w:rPr>
-          <w:rFonts w:ascii="Times New Roman" w:eastAsia="Times New Roman" w:hAnsi="Times New Roman" w:cs="Times New Roman"/>
-          <w:color w:val="auto"/>
-          <w:sz w:val="22"/>
-          <w:szCs w:val="22"/>
-          <w:lang w:val="en-ID" w:eastAsia="en-ID"/>
-        </w:rPr>
-      </w:pPr>
-    </w:p>
-    <w:p>
-      <w:pPr>
-        <w:spacing w:after="120" w:line="360" w:lineRule="auto"/>
-        <w:ind w:left="578" w:firstLine="556"/>
-        <w:jc w:val="both"/>
-        <w:rPr>
-          <w:rFonts w:ascii="Times New Roman" w:eastAsia="Times New Roman" w:hAnsi="Times New Roman" w:cs="Times New Roman"/>
-          <w:color w:val="auto"/>
-          <w:sz w:val="22"/>
-          <w:szCs w:val="22"/>
-          <w:lang w:val="en-ID" w:eastAsia="en-ID"/>
-        </w:rPr>
-      </w:pPr>
-    </w:p>
-    <w:p>
-      <w:pPr>
-        <w:spacing w:after="120" w:line="360" w:lineRule="auto"/>
-        <w:ind w:left="578" w:firstLine="556"/>
-        <w:jc w:val="both"/>
-        <w:rPr>
-          <w:rFonts w:ascii="Times New Roman" w:eastAsia="Times New Roman" w:hAnsi="Times New Roman" w:cs="Times New Roman"/>
-          <w:color w:val="auto"/>
-          <w:sz w:val="22"/>
-          <w:szCs w:val="22"/>
-          <w:lang w:val="en-ID" w:eastAsia="en-ID"/>
-        </w:rPr>
-      </w:pPr>
     </w:p>
     <w:p>
       <w:pPr>
@@ -8847,7 +9245,6 @@
           <w:rFonts w:ascii="Times New Roman" w:hAnsi="Times New Roman" w:cs="Times New Roman"/>
           <w:color w:val="000000" w:themeColor="text1"/>
         </w:rPr>
-        <w:lastRenderedPageBreak/>
         <w:t>C5. Grafik Eksperimen</w:t>
       </w:r>
     </w:p>
@@ -8868,7 +9265,7 @@
           <w:color w:val="000000" w:themeColor="text1"/>
         </w:rPr>
         <w:drawing>
-          <wp:inline distT="0" distB="0" distL="0" distR="0" wp14:anchorId="7A782319" wp14:editId="6DE7827F">
+          <wp:inline distT="0" distB="0" distL="0" distR="0" wp14:anchorId="25FFEC8A" wp14:editId="662226AC">
             <wp:extent cx="5257800" cy="2957512"/>
             <wp:effectExtent l="0" t="0" r="0" b="0"/>
             <wp:docPr id="18" name="Picture 18"/>
@@ -8883,7 +9280,7 @@
                     <pic:cNvPicPr/>
                   </pic:nvPicPr>
                   <pic:blipFill>
-                    <a:blip r:embed="rId18"/>
+                    <a:blip r:embed="rId24"/>
                     <a:stretch>
                       <a:fillRect/>
                     </a:stretch>
@@ -8984,8 +9381,9 @@
           <w:noProof/>
           <w:color w:val="000000" w:themeColor="text1"/>
         </w:rPr>
+        <w:lastRenderedPageBreak/>
         <w:drawing>
-          <wp:inline distT="0" distB="0" distL="0" distR="0" wp14:anchorId="65862B42" wp14:editId="67367D2F">
+          <wp:inline distT="0" distB="0" distL="0" distR="0" wp14:anchorId="47328BB2" wp14:editId="79260520">
             <wp:extent cx="5257800" cy="2957512"/>
             <wp:effectExtent l="0" t="0" r="0" b="0"/>
             <wp:docPr id="19" name="Picture 19"/>
@@ -9000,7 +9398,7 @@
                     <pic:cNvPicPr/>
                   </pic:nvPicPr>
                   <pic:blipFill>
-                    <a:blip r:embed="rId19"/>
+                    <a:blip r:embed="rId25"/>
                     <a:stretch>
                       <a:fillRect/>
                     </a:stretch>
@@ -9101,9 +9499,8 @@
           <w:noProof/>
           <w:color w:val="000000" w:themeColor="text1"/>
         </w:rPr>
-        <w:lastRenderedPageBreak/>
         <w:drawing>
-          <wp:inline distT="0" distB="0" distL="0" distR="0" wp14:anchorId="306D57BB" wp14:editId="6DCB6ABC">
+          <wp:inline distT="0" distB="0" distL="0" distR="0" wp14:anchorId="429F982F" wp14:editId="7F9E0AC7">
             <wp:extent cx="5394960" cy="2877312"/>
             <wp:effectExtent l="0" t="0" r="0" b="0"/>
             <wp:docPr id="20" name="Picture 20"/>
@@ -9118,7 +9515,7 @@
                     <pic:cNvPicPr/>
                   </pic:nvPicPr>
                   <pic:blipFill>
-                    <a:blip r:embed="rId20"/>
+                    <a:blip r:embed="rId26"/>
                     <a:stretch>
                       <a:fillRect/>
                     </a:stretch>
@@ -9241,6 +9638,7 @@
           <w:rFonts w:ascii="Times New Roman" w:hAnsi="Times New Roman" w:cs="Times New Roman"/>
           <w:color w:val="000000" w:themeColor="text1"/>
         </w:rPr>
+        <w:lastRenderedPageBreak/>
         <w:t>C6. Analisis Speedup</w:t>
       </w:r>
     </w:p>
@@ -9347,7 +9745,6 @@
           <w:rFonts w:ascii="Times New Roman" w:hAnsi="Times New Roman" w:cs="Times New Roman"/>
           <w:color w:val="000000" w:themeColor="text1"/>
         </w:rPr>
-        <w:lastRenderedPageBreak/>
         <w:t>C8. Analisis Throughput</w:t>
       </w:r>
     </w:p>
@@ -9996,6 +10393,7 @@
                 <w:color w:val="000000" w:themeColor="text1"/>
                 <w:sz w:val="16"/>
               </w:rPr>
+              <w:lastRenderedPageBreak/>
               <w:t>I/O</w:t>
             </w:r>
           </w:p>
@@ -10363,7 +10761,51 @@
           <w:szCs w:val="22"/>
           <w:lang w:val="en-ID" w:eastAsia="en-ID"/>
         </w:rPr>
-        <w:t xml:space="preserve">Amdahl’s Law menyatakan bahwa fraksi serial membatasi speedup maksimum: S(N)=1/[s+(1−s)/N]. Pada project, merge global, update pheromone/world, barrier, dan bagian koordinasi adalah kandidat komponen yang tidak meningkat sebanding dengan worker. Tanpa mengukur fraksi serial, laporan tidak menetapkan nilai numerik Amdahl. Skalabilitas membutuhkan porsi kerja paralel besar dan biaya komunikasi yang tidak tumbuh lebih cepat daripada manfaatnya. Hasil speedup historis kurang dari satu mengingatkan bahwa penambahan worker </w:t>
+        <w:t xml:space="preserve">Amdahl’s Law menyatakan bahwa fraksi serial membatasi speedup maksimum: S(N)=1/[s+(1−s)/N]. Pada project, merge global, update pheromone/world, barrier, dan bagian koordinasi adalah kandidat komponen yang tidak meningkat sebanding dengan worker. Tanpa mengukur fraksi serial, laporan tidak menetapkan nilai numerik Amdahl. Skalabilitas membutuhkan porsi kerja paralel besar dan biaya komunikasi yang tidak tumbuh lebih cepat daripada manfaatnya. Hasil speedup historis kurang dari satu mengingatkan </w:t>
+      </w:r>
+      <w:proofErr w:type="spellStart"/>
+      <w:r>
+        <w:rPr>
+          <w:rFonts w:ascii="Times New Roman" w:eastAsia="Times New Roman" w:hAnsi="Times New Roman" w:cs="Times New Roman"/>
+          <w:color w:val="auto"/>
+          <w:sz w:val="22"/>
+          <w:szCs w:val="22"/>
+          <w:lang w:val="en-ID" w:eastAsia="en-ID"/>
+        </w:rPr>
+        <w:t>bahwa</w:t>
+      </w:r>
+      <w:proofErr w:type="spellEnd"/>
+      <w:r>
+        <w:rPr>
+          <w:rFonts w:ascii="Times New Roman" w:eastAsia="Times New Roman" w:hAnsi="Times New Roman" w:cs="Times New Roman"/>
+          <w:color w:val="auto"/>
+          <w:sz w:val="22"/>
+          <w:szCs w:val="22"/>
+          <w:lang w:val="en-ID" w:eastAsia="en-ID"/>
+        </w:rPr>
+        <w:t xml:space="preserve"> </w:t>
+      </w:r>
+      <w:proofErr w:type="spellStart"/>
+      <w:r>
+        <w:rPr>
+          <w:rFonts w:ascii="Times New Roman" w:eastAsia="Times New Roman" w:hAnsi="Times New Roman" w:cs="Times New Roman"/>
+          <w:color w:val="auto"/>
+          <w:sz w:val="22"/>
+          <w:szCs w:val="22"/>
+          <w:lang w:val="en-ID" w:eastAsia="en-ID"/>
+        </w:rPr>
+        <w:t>penambahan</w:t>
+      </w:r>
+      <w:proofErr w:type="spellEnd"/>
+      <w:r>
+        <w:rPr>
+          <w:rFonts w:ascii="Times New Roman" w:eastAsia="Times New Roman" w:hAnsi="Times New Roman" w:cs="Times New Roman"/>
+          <w:color w:val="auto"/>
+          <w:sz w:val="22"/>
+          <w:szCs w:val="22"/>
+          <w:lang w:val="en-ID" w:eastAsia="en-ID"/>
+        </w:rPr>
+        <w:t xml:space="preserve"> worker </w:t>
       </w:r>
       <w:proofErr w:type="spellStart"/>
       <w:r>
@@ -10876,7 +11318,23 @@
           <w:rFonts w:ascii="Times New Roman" w:hAnsi="Times New Roman" w:cs="Times New Roman"/>
           <w:color w:val="000000" w:themeColor="text1"/>
         </w:rPr>
-        <w:t xml:space="preserve"> simulasi benar-benar dibagi ke beberapa node dan tersedia kebutuhan/lingkungan cluster; GPU hanya layak diuji jika operasi vektor dapat dipetakan dan overhead transfer data dapat dibenarkan.</w:t>
+        <w:t xml:space="preserve"> </w:t>
+      </w:r>
+      <w:proofErr w:type="spellStart"/>
+      <w:r>
+        <w:rPr>
+          <w:rFonts w:ascii="Times New Roman" w:hAnsi="Times New Roman" w:cs="Times New Roman"/>
+          <w:color w:val="000000" w:themeColor="text1"/>
+        </w:rPr>
+        <w:t>simulasi</w:t>
+      </w:r>
+      <w:proofErr w:type="spellEnd"/>
+      <w:r>
+        <w:rPr>
+          <w:rFonts w:ascii="Times New Roman" w:hAnsi="Times New Roman" w:cs="Times New Roman"/>
+          <w:color w:val="000000" w:themeColor="text1"/>
+        </w:rPr>
+        <w:t xml:space="preserve"> benar-benar dibagi ke beberapa node dan tersedia kebutuhan/lingkungan cluster; GPU hanya layak diuji jika operasi vektor dapat dipetakan dan overhead transfer data dapat dibenarkan.</w:t>
       </w:r>
     </w:p>
     <w:p>
@@ -11113,7 +11571,7 @@
         </w:rPr>
         <w:t xml:space="preserve"> </w:t>
       </w:r>
-      <w:hyperlink r:id="rId21" w:history="1">
+      <w:hyperlink r:id="rId27" w:history="1">
         <w:r>
           <w:rPr>
             <w:rStyle w:val="Hyperlink"/>
@@ -11170,7 +11628,7 @@
         </w:rPr>
         <w:t xml:space="preserve">: </w:t>
       </w:r>
-      <w:hyperlink r:id="rId22" w:history="1">
+      <w:hyperlink r:id="rId28" w:history="1">
         <w:r>
           <w:rPr>
             <w:rStyle w:val="Hyperlink"/>
@@ -11183,8 +11641,8 @@
       </w:hyperlink>
     </w:p>
     <w:sectPr>
-      <w:headerReference w:type="default" r:id="rId23"/>
-      <w:footerReference w:type="default" r:id="rId24"/>
+      <w:headerReference w:type="default" r:id="rId29"/>
+      <w:footerReference w:type="default" r:id="rId30"/>
       <w:pgSz w:w="11906" w:h="16838"/>
       <w:pgMar w:top="1123" w:right="1224" w:bottom="1037" w:left="1224" w:header="504" w:footer="504" w:gutter="0"/>
       <w:cols w:space="720"/>

</xml_diff>